<commit_message>
docs: add clone-first setup guide
Update Markdown and Word operation manuals with GitHub clone, Demo, remote model, local Ollama, RAG indexing, troubleshooting, and first-run verification steps.
</commit_message>
<xml_diff>
--- a/金融多智能体系统_详细操作手册.docx
+++ b/金融多智能体系统_详细操作手册.docx
@@ -315,7 +315,7 @@
                 <w:color w:val="475467"/>
                 <w:sz w:val="21"/>
               </w:rPr>
-              <w:t>v0.1.0 · 2026 年 8 月</w:t>
+              <w:t>v0.2.0 · 2026 年 8 月</w:t>
             </w:r>
           </w:p>
         </w:tc>
@@ -497,7 +497,7 @@
           <w:color w:val="475467"/>
           <w:sz w:val="21"/>
         </w:rPr>
-        <w:t>2. 第一次运行前的准备</w:t>
+        <w:t>2. 从 GitHub Clone 后开始</w:t>
       </w:r>
     </w:p>
     <w:p>
@@ -510,7 +510,7 @@
           <w:color w:val="475467"/>
           <w:sz w:val="21"/>
         </w:rPr>
-        <w:t>2.1 检查 Python</w:t>
+        <w:t>2.1 获取项目</w:t>
       </w:r>
     </w:p>
     <w:p>
@@ -523,7 +523,7 @@
           <w:color w:val="475467"/>
           <w:sz w:val="21"/>
         </w:rPr>
-        <w:t>2.2 进入项目目录</w:t>
+        <w:t>2.2 检查 Python</w:t>
       </w:r>
     </w:p>
     <w:p>
@@ -536,7 +536,59 @@
           <w:color w:val="475467"/>
           <w:sz w:val="21"/>
         </w:rPr>
-        <w:t>2.3 不要提交或分享这些内容</w:t>
+        <w:t>2.1 检查 Python</w:t>
+      </w:r>
+    </w:p>
+    <w:p>
+      <w:pPr>
+        <w:pStyle w:val="ListBullet"/>
+      </w:pPr>
+      <w:r>
+        <w:rPr>
+          <w:rFonts w:ascii=".CJK Symbols Fallback SC" w:hAnsi=".CJK Symbols Fallback SC" w:eastAsia=".CJK Symbols Fallback SC" w:cs=".CJK Symbols Fallback SC" w:hint="eastAsia"/>
+          <w:color w:val="475467"/>
+          <w:sz w:val="21"/>
+        </w:rPr>
+        <w:t>2.3 确认当前目录</w:t>
+      </w:r>
+    </w:p>
+    <w:p>
+      <w:pPr>
+        <w:pStyle w:val="ListBullet"/>
+      </w:pPr>
+      <w:r>
+        <w:rPr>
+          <w:rFonts w:ascii=".CJK Symbols Fallback SC" w:hAnsi=".CJK Symbols Fallback SC" w:eastAsia=".CJK Symbols Fallback SC" w:cs=".CJK Symbols Fallback SC" w:hint="eastAsia"/>
+          <w:color w:val="475467"/>
+          <w:sz w:val="21"/>
+        </w:rPr>
+        <w:t>2.4 三条运行路径怎么选</w:t>
+      </w:r>
+    </w:p>
+    <w:p>
+      <w:pPr>
+        <w:pStyle w:val="ListBullet"/>
+      </w:pPr>
+      <w:r>
+        <w:rPr>
+          <w:rFonts w:ascii=".CJK Symbols Fallback SC" w:hAnsi=".CJK Symbols Fallback SC" w:eastAsia=".CJK Symbols Fallback SC" w:cs=".CJK Symbols Fallback SC" w:hint="eastAsia"/>
+          <w:color w:val="475467"/>
+          <w:sz w:val="21"/>
+        </w:rPr>
+        <w:t>2.5 不要提交或分享这些内容</w:t>
+      </w:r>
+    </w:p>
+    <w:p>
+      <w:pPr>
+        <w:pStyle w:val="ListBullet"/>
+      </w:pPr>
+      <w:r>
+        <w:rPr>
+          <w:rFonts w:ascii=".CJK Symbols Fallback SC" w:hAnsi=".CJK Symbols Fallback SC" w:eastAsia=".CJK Symbols Fallback SC" w:cs=".CJK Symbols Fallback SC" w:hint="eastAsia"/>
+          <w:color w:val="475467"/>
+          <w:sz w:val="21"/>
+        </w:rPr>
+        <w:t>2.6 Clone 后三分钟验证路径</w:t>
       </w:r>
     </w:p>
     <w:p>
@@ -1775,7 +1827,7 @@
         <w:pStyle w:val="Heading1"/>
       </w:pPr>
       <w:r>
-        <w:t>2. 第一次运行前的准备</w:t>
+        <w:t>2. 从 GitHub Clone 后开始</w:t>
       </w:r>
     </w:p>
     <w:p>
@@ -1783,17 +1835,17 @@
         <w:pStyle w:val="Heading2"/>
       </w:pPr>
       <w:r>
-        <w:t>2.1 检查 Python</w:t>
-      </w:r>
-    </w:p>
-    <w:p>
-      <w:r>
-        <w:rPr>
-          <w:rFonts w:ascii=".CJK Symbols Fallback SC" w:hAnsi=".CJK Symbols Fallback SC" w:eastAsia=".CJK Symbols Fallback SC" w:cs=".CJK Symbols Fallback SC" w:hint="eastAsia"/>
-          <w:color w:val="16324F"/>
-          <w:sz w:val="22"/>
-        </w:rPr>
-        <w:t>需要 Python 3.10 或更高版本：</w:t>
+        <w:t>2.1 获取项目</w:t>
+      </w:r>
+    </w:p>
+    <w:p>
+      <w:r>
+        <w:rPr>
+          <w:rFonts w:ascii=".CJK Symbols Fallback SC" w:hAnsi=".CJK Symbols Fallback SC" w:eastAsia=".CJK Symbols Fallback SC" w:cs=".CJK Symbols Fallback SC" w:hint="eastAsia"/>
+          <w:color w:val="16324F"/>
+          <w:sz w:val="22"/>
+        </w:rPr>
+        <w:t>先确认电脑已安装 Git：</w:t>
       </w:r>
     </w:p>
     <w:p>
@@ -1821,17 +1873,17 @@
           <w:color w:val="16324F"/>
           <w:sz w:val="22"/>
         </w:rPr>
-        <w:t>python3 --version</w:t>
-      </w:r>
-    </w:p>
-    <w:p>
-      <w:r>
-        <w:rPr>
-          <w:rFonts w:ascii=".CJK Symbols Fallback SC" w:hAnsi=".CJK Symbols Fallback SC" w:eastAsia=".CJK Symbols Fallback SC" w:cs=".CJK Symbols Fallback SC" w:hint="eastAsia"/>
-          <w:color w:val="16324F"/>
-          <w:sz w:val="22"/>
-        </w:rPr>
-        <w:t>Windows PowerShell：</w:t>
+        <w:t>git --version</w:t>
+      </w:r>
+    </w:p>
+    <w:p>
+      <w:r>
+        <w:rPr>
+          <w:rFonts w:ascii=".CJK Symbols Fallback SC" w:hAnsi=".CJK Symbols Fallback SC" w:eastAsia=".CJK Symbols Fallback SC" w:cs=".CJK Symbols Fallback SC" w:hint="eastAsia"/>
+          <w:color w:val="16324F"/>
+          <w:sz w:val="22"/>
+        </w:rPr>
+        <w:t>在终端执行：</w:t>
       </w:r>
     </w:p>
     <w:p>
@@ -1845,7 +1897,7 @@
           <w:color w:val="A87127"/>
           <w:sz w:val="16"/>
         </w:rPr>
-        <w:t>POWERSHELL</w:t>
+        <w:t>BASH</w:t>
       </w:r>
     </w:p>
     <w:p>
@@ -1859,25 +1911,31 @@
           <w:color w:val="16324F"/>
           <w:sz w:val="22"/>
         </w:rPr>
-        <w:t>python --version</w:t>
-      </w:r>
-    </w:p>
-    <w:p>
-      <w:pPr>
-        <w:pStyle w:val="Heading2"/>
-      </w:pPr>
-      <w:r>
-        <w:t>2.2 进入项目目录</w:t>
-      </w:r>
-    </w:p>
-    <w:p>
-      <w:r>
-        <w:rPr>
-          <w:rFonts w:ascii=".CJK Symbols Fallback SC" w:hAnsi=".CJK Symbols Fallback SC" w:eastAsia=".CJK Symbols Fallback SC" w:cs=".CJK Symbols Fallback SC" w:hint="eastAsia"/>
-          <w:color w:val="16324F"/>
-          <w:sz w:val="22"/>
-        </w:rPr>
-        <w:t>macOS/Linux：</w:t>
+        <w:t>git clone https://github.com/Wing-Chen0731/financial-multi-agent-due-diligence.git</w:t>
+      </w:r>
+    </w:p>
+    <w:p>
+      <w:pPr>
+        <w:pStyle w:val="ManualCode"/>
+        <w:shd w:fill="F4F6F8"/>
+      </w:pPr>
+      <w:r>
+        <w:rPr>
+          <w:rFonts w:ascii=".CJK Symbols Fallback SC" w:hAnsi=".CJK Symbols Fallback SC" w:eastAsia=".CJK Symbols Fallback SC" w:cs=".CJK Symbols Fallback SC" w:hint="eastAsia"/>
+          <w:color w:val="16324F"/>
+          <w:sz w:val="22"/>
+        </w:rPr>
+        <w:t>cd financial-multi-agent-due-diligence</w:t>
+      </w:r>
+    </w:p>
+    <w:p>
+      <w:r>
+        <w:rPr>
+          <w:rFonts w:ascii=".CJK Symbols Fallback SC" w:hAnsi=".CJK Symbols Fallback SC" w:eastAsia=".CJK Symbols Fallback SC" w:cs=".CJK Symbols Fallback SC" w:hint="eastAsia"/>
+          <w:color w:val="16324F"/>
+          <w:sz w:val="22"/>
+        </w:rPr>
+        <w:t>Windows PowerShell 使用同样的命令：</w:t>
       </w:r>
     </w:p>
     <w:p>
@@ -1891,7 +1949,7 @@
           <w:color w:val="A87127"/>
           <w:sz w:val="16"/>
         </w:rPr>
-        <w:t>BASH</w:t>
+        <w:t>POWERSHELL</w:t>
       </w:r>
     </w:p>
     <w:p>
@@ -1905,27 +1963,31 @@
           <w:color w:val="16324F"/>
           <w:sz w:val="22"/>
         </w:rPr>
-        <w:t>cd "/Users/chenwy188/Documents/ChatGPT/金融多agent系统"</w:t>
-      </w:r>
-    </w:p>
-    <w:p>
-      <w:r>
-        <w:rPr>
-          <w:rFonts w:ascii=".CJK Symbols Fallback SC" w:hAnsi=".CJK Symbols Fallback SC" w:eastAsia=".CJK Symbols Fallback SC" w:cs=".CJK Symbols Fallback SC" w:hint="eastAsia"/>
-          <w:color w:val="16324F"/>
-          <w:sz w:val="22"/>
-        </w:rPr>
-        <w:t>如果项目已经复制到其他位置，请将上面的路径替换为实际项目路径。</w:t>
-      </w:r>
-    </w:p>
-    <w:p>
-      <w:r>
-        <w:rPr>
-          <w:rFonts w:ascii=".CJK Symbols Fallback SC" w:hAnsi=".CJK Symbols Fallback SC" w:eastAsia=".CJK Symbols Fallback SC" w:cs=".CJK Symbols Fallback SC" w:hint="eastAsia"/>
-          <w:color w:val="16324F"/>
-          <w:sz w:val="22"/>
-        </w:rPr>
-        <w:t>Windows PowerShell：</w:t>
+        <w:t>git clone https://github.com/Wing-Chen0731/financial-multi-agent-due-diligence.git</w:t>
+      </w:r>
+    </w:p>
+    <w:p>
+      <w:pPr>
+        <w:pStyle w:val="ManualCode"/>
+        <w:shd w:fill="F4F6F8"/>
+      </w:pPr>
+      <w:r>
+        <w:rPr>
+          <w:rFonts w:ascii=".CJK Symbols Fallback SC" w:hAnsi=".CJK Symbols Fallback SC" w:eastAsia=".CJK Symbols Fallback SC" w:cs=".CJK Symbols Fallback SC" w:hint="eastAsia"/>
+          <w:color w:val="16324F"/>
+          <w:sz w:val="22"/>
+        </w:rPr>
+        <w:t>cd financial-multi-agent-due-diligence</w:t>
+      </w:r>
+    </w:p>
+    <w:p>
+      <w:r>
+        <w:rPr>
+          <w:rFonts w:ascii=".CJK Symbols Fallback SC" w:hAnsi=".CJK Symbols Fallback SC" w:eastAsia=".CJK Symbols Fallback SC" w:cs=".CJK Symbols Fallback SC" w:hint="eastAsia"/>
+          <w:color w:val="16324F"/>
+          <w:sz w:val="22"/>
+        </w:rPr>
+        <w:t>如果已经 Clone 过，进入项目目录并拉取最新版本：</w:t>
       </w:r>
     </w:p>
     <w:p>
@@ -1939,7 +2001,7 @@
           <w:color w:val="A87127"/>
           <w:sz w:val="16"/>
         </w:rPr>
-        <w:t>POWERSHELL</w:t>
+        <w:t>BASH</w:t>
       </w:r>
     </w:p>
     <w:p>
@@ -1953,7 +2015,21 @@
           <w:color w:val="16324F"/>
           <w:sz w:val="22"/>
         </w:rPr>
-        <w:t>cd "你的项目目录"</w:t>
+        <w:t>cd financial-multi-agent-due-diligence</w:t>
+      </w:r>
+    </w:p>
+    <w:p>
+      <w:pPr>
+        <w:pStyle w:val="ManualCode"/>
+        <w:shd w:fill="F4F6F8"/>
+      </w:pPr>
+      <w:r>
+        <w:rPr>
+          <w:rFonts w:ascii=".CJK Symbols Fallback SC" w:hAnsi=".CJK Symbols Fallback SC" w:eastAsia=".CJK Symbols Fallback SC" w:cs=".CJK Symbols Fallback SC" w:hint="eastAsia"/>
+          <w:color w:val="16324F"/>
+          <w:sz w:val="22"/>
+        </w:rPr>
+        <w:t>git pull origin main</w:t>
       </w:r>
     </w:p>
     <w:p>
@@ -1961,128 +2037,866 @@
         <w:pStyle w:val="Heading2"/>
       </w:pPr>
       <w:r>
-        <w:t>2.3 不要提交或分享这些内容</w:t>
-      </w:r>
-    </w:p>
-    <w:p>
-      <w:r>
-        <w:rPr>
-          <w:rFonts w:ascii=".CJK Symbols Fallback SC" w:hAnsi=".CJK Symbols Fallback SC" w:eastAsia=".CJK Symbols Fallback SC" w:cs=".CJK Symbols Fallback SC" w:hint="eastAsia"/>
-          <w:color w:val="16324F"/>
-          <w:sz w:val="22"/>
-        </w:rPr>
-        <w:t>不要把以下内容上传到 GitHub 或发给他人：</w:t>
-      </w:r>
-    </w:p>
-    <w:p>
-      <w:pPr>
-        <w:pStyle w:val="ListBullet"/>
-      </w:pPr>
+        <w:t>2.2 检查 Python</w:t>
+      </w:r>
+    </w:p>
+    <w:p>
+      <w:pPr>
+        <w:pStyle w:val="Heading2"/>
+      </w:pPr>
+      <w:r>
+        <w:t>2.1 检查 Python</w:t>
+      </w:r>
+    </w:p>
+    <w:p>
+      <w:r>
+        <w:rPr>
+          <w:rFonts w:ascii=".CJK Symbols Fallback SC" w:hAnsi=".CJK Symbols Fallback SC" w:eastAsia=".CJK Symbols Fallback SC" w:cs=".CJK Symbols Fallback SC" w:hint="eastAsia"/>
+          <w:color w:val="16324F"/>
+          <w:sz w:val="22"/>
+        </w:rPr>
+        <w:t>需要 Python 3.10 或更高版本：</w:t>
+      </w:r>
+    </w:p>
+    <w:p>
+      <w:pPr>
+        <w:spacing w:before="100" w:after="40"/>
+      </w:pPr>
+      <w:r>
+        <w:rPr>
+          <w:rFonts w:ascii=".CJK Symbols Fallback SC" w:hAnsi=".CJK Symbols Fallback SC" w:eastAsia=".CJK Symbols Fallback SC" w:cs=".CJK Symbols Fallback SC" w:hint="eastAsia"/>
+          <w:b/>
+          <w:color w:val="A87127"/>
+          <w:sz w:val="16"/>
+        </w:rPr>
+        <w:t>BASH</w:t>
+      </w:r>
+    </w:p>
+    <w:p>
+      <w:pPr>
+        <w:pStyle w:val="ManualCode"/>
+        <w:shd w:fill="F4F6F8"/>
+      </w:pPr>
+      <w:r>
+        <w:rPr>
+          <w:rFonts w:ascii=".CJK Symbols Fallback SC" w:hAnsi=".CJK Symbols Fallback SC" w:eastAsia=".CJK Symbols Fallback SC" w:cs=".CJK Symbols Fallback SC" w:hint="eastAsia"/>
+          <w:color w:val="16324F"/>
+          <w:sz w:val="22"/>
+        </w:rPr>
+        <w:t>python3 --version</w:t>
+      </w:r>
+    </w:p>
+    <w:p>
+      <w:r>
+        <w:rPr>
+          <w:rFonts w:ascii=".CJK Symbols Fallback SC" w:hAnsi=".CJK Symbols Fallback SC" w:eastAsia=".CJK Symbols Fallback SC" w:cs=".CJK Symbols Fallback SC" w:hint="eastAsia"/>
+          <w:color w:val="16324F"/>
+          <w:sz w:val="22"/>
+        </w:rPr>
+        <w:t>Windows PowerShell：</w:t>
+      </w:r>
+    </w:p>
+    <w:p>
+      <w:pPr>
+        <w:spacing w:before="100" w:after="40"/>
+      </w:pPr>
+      <w:r>
+        <w:rPr>
+          <w:rFonts w:ascii=".CJK Symbols Fallback SC" w:hAnsi=".CJK Symbols Fallback SC" w:eastAsia=".CJK Symbols Fallback SC" w:cs=".CJK Symbols Fallback SC" w:hint="eastAsia"/>
+          <w:b/>
+          <w:color w:val="A87127"/>
+          <w:sz w:val="16"/>
+        </w:rPr>
+        <w:t>POWERSHELL</w:t>
+      </w:r>
+    </w:p>
+    <w:p>
+      <w:pPr>
+        <w:pStyle w:val="ManualCode"/>
+        <w:shd w:fill="F4F6F8"/>
+      </w:pPr>
+      <w:r>
+        <w:rPr>
+          <w:rFonts w:ascii=".CJK Symbols Fallback SC" w:hAnsi=".CJK Symbols Fallback SC" w:eastAsia=".CJK Symbols Fallback SC" w:cs=".CJK Symbols Fallback SC" w:hint="eastAsia"/>
+          <w:color w:val="16324F"/>
+          <w:sz w:val="22"/>
+        </w:rPr>
+        <w:t>python --version</w:t>
+      </w:r>
+    </w:p>
+    <w:p>
+      <w:pPr>
+        <w:pStyle w:val="Heading2"/>
+      </w:pPr>
+      <w:r>
+        <w:t>2.3 确认当前目录</w:t>
+      </w:r>
+    </w:p>
+    <w:p>
+      <w:r>
+        <w:rPr>
+          <w:rFonts w:ascii=".CJK Symbols Fallback SC" w:hAnsi=".CJK Symbols Fallback SC" w:eastAsia=".CJK Symbols Fallback SC" w:cs=".CJK Symbols Fallback SC" w:hint="eastAsia"/>
+          <w:color w:val="16324F"/>
+          <w:sz w:val="22"/>
+        </w:rPr>
+        <w:t>macOS/Linux：</w:t>
+      </w:r>
+    </w:p>
+    <w:p>
+      <w:pPr>
+        <w:spacing w:before="100" w:after="40"/>
+      </w:pPr>
+      <w:r>
+        <w:rPr>
+          <w:rFonts w:ascii=".CJK Symbols Fallback SC" w:hAnsi=".CJK Symbols Fallback SC" w:eastAsia=".CJK Symbols Fallback SC" w:cs=".CJK Symbols Fallback SC" w:hint="eastAsia"/>
+          <w:b/>
+          <w:color w:val="A87127"/>
+          <w:sz w:val="16"/>
+        </w:rPr>
+        <w:t>BASH</w:t>
+      </w:r>
+    </w:p>
+    <w:p>
+      <w:pPr>
+        <w:pStyle w:val="ManualCode"/>
+        <w:shd w:fill="F4F6F8"/>
+      </w:pPr>
+      <w:r>
+        <w:rPr>
+          <w:rFonts w:ascii=".CJK Symbols Fallback SC" w:hAnsi=".CJK Symbols Fallback SC" w:eastAsia=".CJK Symbols Fallback SC" w:cs=".CJK Symbols Fallback SC" w:hint="eastAsia"/>
+          <w:color w:val="16324F"/>
+          <w:sz w:val="22"/>
+        </w:rPr>
+        <w:t>pwd</w:t>
+      </w:r>
+    </w:p>
+    <w:p>
+      <w:pPr>
+        <w:pStyle w:val="ManualCode"/>
+        <w:shd w:fill="F4F6F8"/>
+      </w:pPr>
+      <w:r>
+        <w:rPr>
+          <w:rFonts w:ascii=".CJK Symbols Fallback SC" w:hAnsi=".CJK Symbols Fallback SC" w:eastAsia=".CJK Symbols Fallback SC" w:cs=".CJK Symbols Fallback SC" w:hint="eastAsia"/>
+          <w:color w:val="16324F"/>
+          <w:sz w:val="22"/>
+        </w:rPr>
+        <w:t>ls</w:t>
+      </w:r>
+    </w:p>
+    <w:p>
+      <w:r>
+        <w:rPr>
+          <w:rFonts w:ascii=".CJK Symbols Fallback SC" w:hAnsi=".CJK Symbols Fallback SC" w:eastAsia=".CJK Symbols Fallback SC" w:cs=".CJK Symbols Fallback SC" w:hint="eastAsia"/>
+          <w:color w:val="16324F"/>
+          <w:sz w:val="22"/>
+        </w:rPr>
+        <w:t xml:space="preserve">正常情况下可以看到 </w:t>
+      </w:r>
       <w:r>
         <w:rPr>
           <w:rFonts w:ascii="Consolas" w:hAnsi="Consolas" w:eastAsia=".CJK Symbols Fallback SC" w:cs=".CJK Symbols Fallback SC" w:hint="eastAsia"/>
           <w:color w:val="344054"/>
           <w:sz w:val="19"/>
         </w:rPr>
-        <w:t>.env</w:t>
-      </w:r>
-    </w:p>
-    <w:p>
-      <w:pPr>
-        <w:pStyle w:val="ListBullet"/>
-      </w:pPr>
+        <w:t>README.md</w:t>
+      </w:r>
+      <w:r>
+        <w:rPr>
+          <w:rFonts w:ascii=".CJK Symbols Fallback SC" w:hAnsi=".CJK Symbols Fallback SC" w:eastAsia=".CJK Symbols Fallback SC" w:cs=".CJK Symbols Fallback SC" w:hint="eastAsia"/>
+          <w:color w:val="16324F"/>
+          <w:sz w:val="22"/>
+        </w:rPr>
+        <w:t>、</w:t>
+      </w:r>
       <w:r>
         <w:rPr>
           <w:rFonts w:ascii="Consolas" w:hAnsi="Consolas" w:eastAsia=".CJK Symbols Fallback SC" w:cs=".CJK Symbols Fallback SC" w:hint="eastAsia"/>
           <w:color w:val="344054"/>
           <w:sz w:val="19"/>
         </w:rPr>
-        <w:t>.env.remote</w:t>
-      </w:r>
-    </w:p>
-    <w:p>
-      <w:pPr>
-        <w:pStyle w:val="ListBullet"/>
-      </w:pPr>
-      <w:r>
-        <w:rPr>
-          <w:rFonts w:ascii=".CJK Symbols Fallback SC" w:hAnsi=".CJK Symbols Fallback SC" w:eastAsia=".CJK Symbols Fallback SC" w:cs=".CJK Symbols Fallback SC" w:hint="eastAsia"/>
-          <w:color w:val="16324F"/>
-          <w:sz w:val="22"/>
-        </w:rPr>
-        <w:t>真实 API Key</w:t>
-      </w:r>
-    </w:p>
-    <w:p>
-      <w:pPr>
-        <w:pStyle w:val="ListBullet"/>
-      </w:pPr>
+        <w:t>scripts</w:t>
+      </w:r>
+      <w:r>
+        <w:rPr>
+          <w:rFonts w:ascii=".CJK Symbols Fallback SC" w:hAnsi=".CJK Symbols Fallback SC" w:eastAsia=".CJK Symbols Fallback SC" w:cs=".CJK Symbols Fallback SC" w:hint="eastAsia"/>
+          <w:color w:val="16324F"/>
+          <w:sz w:val="22"/>
+        </w:rPr>
+        <w:t>、</w:t>
+      </w:r>
       <w:r>
         <w:rPr>
           <w:rFonts w:ascii="Consolas" w:hAnsi="Consolas" w:eastAsia=".CJK Symbols Fallback SC" w:cs=".CJK Symbols Fallback SC" w:hint="eastAsia"/>
           <w:color w:val="344054"/>
           <w:sz w:val="19"/>
         </w:rPr>
-        <w:t>.venv/</w:t>
-      </w:r>
-    </w:p>
-    <w:p>
-      <w:pPr>
-        <w:pStyle w:val="ListBullet"/>
-      </w:pPr>
-      <w:r>
-        <w:rPr>
-          <w:rFonts w:ascii=".CJK Symbols Fallback SC" w:hAnsi=".CJK Symbols Fallback SC" w:eastAsia=".CJK Symbols Fallback SC" w:cs=".CJK Symbols Fallback SC" w:hint="eastAsia"/>
-          <w:color w:val="16324F"/>
-          <w:sz w:val="22"/>
-        </w:rPr>
-        <w:t>Ollama 模型文件</w:t>
-      </w:r>
-    </w:p>
-    <w:p>
-      <w:pPr>
-        <w:pStyle w:val="ListBullet"/>
-      </w:pPr>
+        <w:t>src</w:t>
+      </w:r>
+      <w:r>
+        <w:rPr>
+          <w:rFonts w:ascii=".CJK Symbols Fallback SC" w:hAnsi=".CJK Symbols Fallback SC" w:eastAsia=".CJK Symbols Fallback SC" w:cs=".CJK Symbols Fallback SC" w:hint="eastAsia"/>
+          <w:color w:val="16324F"/>
+          <w:sz w:val="22"/>
+        </w:rPr>
+        <w:t xml:space="preserve"> 和 </w:t>
+      </w:r>
       <w:r>
         <w:rPr>
           <w:rFonts w:ascii="Consolas" w:hAnsi="Consolas" w:eastAsia=".CJK Symbols Fallback SC" w:cs=".CJK Symbols Fallback SC" w:hint="eastAsia"/>
           <w:color w:val="344054"/>
           <w:sz w:val="19"/>
         </w:rPr>
-        <w:t>data/vector_db/</w:t>
-      </w:r>
-    </w:p>
-    <w:p>
-      <w:r>
-        <w:rPr>
-          <w:rFonts w:ascii=".CJK Symbols Fallback SC" w:hAnsi=".CJK Symbols Fallback SC" w:eastAsia=".CJK Symbols Fallback SC" w:cs=".CJK Symbols Fallback SC" w:hint="eastAsia"/>
-          <w:color w:val="16324F"/>
-          <w:sz w:val="22"/>
-        </w:rPr>
-        <w:t xml:space="preserve">项目中提供的是 </w:t>
-      </w:r>
+        <w:t>web</w:t>
+      </w:r>
+      <w:r>
+        <w:rPr>
+          <w:rFonts w:ascii=".CJK Symbols Fallback SC" w:hAnsi=".CJK Symbols Fallback SC" w:eastAsia=".CJK Symbols Fallback SC" w:cs=".CJK Symbols Fallback SC" w:hint="eastAsia"/>
+          <w:color w:val="16324F"/>
+          <w:sz w:val="22"/>
+        </w:rPr>
+        <w:t xml:space="preserve"> 等文件夹。</w:t>
+      </w:r>
+    </w:p>
+    <w:p>
+      <w:r>
+        <w:rPr>
+          <w:rFonts w:ascii=".CJK Symbols Fallback SC" w:hAnsi=".CJK Symbols Fallback SC" w:eastAsia=".CJK Symbols Fallback SC" w:cs=".CJK Symbols Fallback SC" w:hint="eastAsia"/>
+          <w:color w:val="16324F"/>
+          <w:sz w:val="22"/>
+        </w:rPr>
+        <w:t>Windows PowerShell：</w:t>
+      </w:r>
+    </w:p>
+    <w:p>
+      <w:pPr>
+        <w:spacing w:before="100" w:after="40"/>
+      </w:pPr>
+      <w:r>
+        <w:rPr>
+          <w:rFonts w:ascii=".CJK Symbols Fallback SC" w:hAnsi=".CJK Symbols Fallback SC" w:eastAsia=".CJK Symbols Fallback SC" w:cs=".CJK Symbols Fallback SC" w:hint="eastAsia"/>
+          <w:b/>
+          <w:color w:val="A87127"/>
+          <w:sz w:val="16"/>
+        </w:rPr>
+        <w:t>POWERSHELL</w:t>
+      </w:r>
+    </w:p>
+    <w:p>
+      <w:pPr>
+        <w:pStyle w:val="ManualCode"/>
+        <w:shd w:fill="F4F6F8"/>
+      </w:pPr>
+      <w:r>
+        <w:rPr>
+          <w:rFonts w:ascii=".CJK Symbols Fallback SC" w:hAnsi=".CJK Symbols Fallback SC" w:eastAsia=".CJK Symbols Fallback SC" w:cs=".CJK Symbols Fallback SC" w:hint="eastAsia"/>
+          <w:color w:val="16324F"/>
+          <w:sz w:val="22"/>
+        </w:rPr>
+        <w:t>Get-Location</w:t>
+      </w:r>
+    </w:p>
+    <w:p>
+      <w:pPr>
+        <w:pStyle w:val="ManualCode"/>
+        <w:shd w:fill="F4F6F8"/>
+      </w:pPr>
+      <w:r>
+        <w:rPr>
+          <w:rFonts w:ascii=".CJK Symbols Fallback SC" w:hAnsi=".CJK Symbols Fallback SC" w:eastAsia=".CJK Symbols Fallback SC" w:cs=".CJK Symbols Fallback SC" w:hint="eastAsia"/>
+          <w:color w:val="16324F"/>
+          <w:sz w:val="22"/>
+        </w:rPr>
+        <w:t>Get-ChildItem</w:t>
+      </w:r>
+    </w:p>
+    <w:p>
+      <w:pPr>
+        <w:pStyle w:val="Heading2"/>
+      </w:pPr>
+      <w:r>
+        <w:t>2.4 三条运行路径怎么选</w:t>
+      </w:r>
+    </w:p>
+    <w:tbl>
+      <w:tblPr>
+        <w:tblStyle w:val="TableGrid"/>
+        <w:tblW w:type="dxa" w:w="9360"/>
+        <w:jc w:val="left"/>
+        <w:tblLayout w:type="fixed"/>
+        <w:tblLook w:firstColumn="1" w:firstRow="1" w:lastColumn="0" w:lastRow="0" w:noHBand="0" w:noVBand="1" w:val="04A0"/>
+        <w:tblInd w:w="120" w:type="dxa"/>
+      </w:tblPr>
+      <w:tblGrid>
+        <w:gridCol w:w="1600"/>
+        <w:gridCol w:w="3300"/>
+        <w:gridCol w:w="4460"/>
+      </w:tblGrid>
+      <w:tr>
+        <w:trPr>
+          <w:tblHeader w:val="true"/>
+        </w:trPr>
+        <w:tc>
+          <w:tcPr>
+            <w:tcW w:type="dxa" w:w="1600"/>
+            <w:vAlign w:val="center"/>
+            <w:tcMar>
+              <w:top w:w="80" w:type="dxa"/>
+              <w:start w:w="120" w:type="dxa"/>
+              <w:bottom w:w="80" w:type="dxa"/>
+              <w:end w:w="120" w:type="dxa"/>
+            </w:tcMar>
+            <w:shd w:fill="E8EEF5"/>
+          </w:tcPr>
+          <w:p>
+            <w:pPr>
+              <w:spacing w:after="40" w:line="264" w:lineRule="auto"/>
+            </w:pPr>
+            <w:r>
+              <w:rPr>
+                <w:rFonts w:ascii=".CJK Symbols Fallback SC" w:hAnsi=".CJK Symbols Fallback SC" w:eastAsia=".CJK Symbols Fallback SC" w:cs=".CJK Symbols Fallback SC" w:hint="eastAsia"/>
+                <w:b/>
+                <w:color w:val="16324F"/>
+                <w:sz w:val="19"/>
+              </w:rPr>
+            </w:r>
+            <w:r>
+              <w:rPr>
+                <w:rFonts w:ascii=".CJK Symbols Fallback SC" w:hAnsi=".CJK Symbols Fallback SC" w:eastAsia=".CJK Symbols Fallback SC" w:cs=".CJK Symbols Fallback SC" w:hint="eastAsia"/>
+                <w:b/>
+                <w:color w:val="16324F"/>
+                <w:sz w:val="19"/>
+              </w:rPr>
+              <w:t>目标</w:t>
+            </w:r>
+          </w:p>
+        </w:tc>
+        <w:tc>
+          <w:tcPr>
+            <w:tcW w:type="dxa" w:w="3300"/>
+            <w:vAlign w:val="center"/>
+            <w:tcMar>
+              <w:top w:w="80" w:type="dxa"/>
+              <w:start w:w="120" w:type="dxa"/>
+              <w:bottom w:w="80" w:type="dxa"/>
+              <w:end w:w="120" w:type="dxa"/>
+            </w:tcMar>
+            <w:shd w:fill="E8EEF5"/>
+          </w:tcPr>
+          <w:p>
+            <w:pPr>
+              <w:spacing w:after="40" w:line="264" w:lineRule="auto"/>
+            </w:pPr>
+            <w:r>
+              <w:rPr>
+                <w:rFonts w:ascii=".CJK Symbols Fallback SC" w:hAnsi=".CJK Symbols Fallback SC" w:eastAsia=".CJK Symbols Fallback SC" w:cs=".CJK Symbols Fallback SC" w:hint="eastAsia"/>
+                <w:b/>
+                <w:color w:val="16324F"/>
+                <w:sz w:val="19"/>
+              </w:rPr>
+            </w:r>
+            <w:r>
+              <w:rPr>
+                <w:rFonts w:ascii=".CJK Symbols Fallback SC" w:hAnsi=".CJK Symbols Fallback SC" w:eastAsia=".CJK Symbols Fallback SC" w:cs=".CJK Symbols Fallback SC" w:hint="eastAsia"/>
+                <w:b/>
+                <w:color w:val="16324F"/>
+                <w:sz w:val="19"/>
+              </w:rPr>
+              <w:t>推荐路径</w:t>
+            </w:r>
+          </w:p>
+        </w:tc>
+        <w:tc>
+          <w:tcPr>
+            <w:tcW w:type="dxa" w:w="4460"/>
+            <w:vAlign w:val="center"/>
+            <w:tcMar>
+              <w:top w:w="80" w:type="dxa"/>
+              <w:start w:w="120" w:type="dxa"/>
+              <w:bottom w:w="80" w:type="dxa"/>
+              <w:end w:w="120" w:type="dxa"/>
+            </w:tcMar>
+            <w:shd w:fill="E8EEF5"/>
+          </w:tcPr>
+          <w:p>
+            <w:pPr>
+              <w:spacing w:after="40" w:line="264" w:lineRule="auto"/>
+            </w:pPr>
+            <w:r>
+              <w:rPr>
+                <w:rFonts w:ascii=".CJK Symbols Fallback SC" w:hAnsi=".CJK Symbols Fallback SC" w:eastAsia=".CJK Symbols Fallback SC" w:cs=".CJK Symbols Fallback SC" w:hint="eastAsia"/>
+                <w:b/>
+                <w:color w:val="16324F"/>
+                <w:sz w:val="19"/>
+              </w:rPr>
+            </w:r>
+            <w:r>
+              <w:rPr>
+                <w:rFonts w:ascii=".CJK Symbols Fallback SC" w:hAnsi=".CJK Symbols Fallback SC" w:eastAsia=".CJK Symbols Fallback SC" w:cs=".CJK Symbols Fallback SC" w:hint="eastAsia"/>
+                <w:b/>
+                <w:color w:val="16324F"/>
+                <w:sz w:val="19"/>
+              </w:rPr>
+              <w:t>是否下载大模型</w:t>
+            </w:r>
+          </w:p>
+        </w:tc>
+      </w:tr>
+      <w:tr>
+        <w:tc>
+          <w:tcPr>
+            <w:tcW w:type="dxa" w:w="1600"/>
+            <w:vAlign w:val="center"/>
+            <w:tcMar>
+              <w:top w:w="80" w:type="dxa"/>
+              <w:start w:w="120" w:type="dxa"/>
+              <w:bottom w:w="80" w:type="dxa"/>
+              <w:end w:w="120" w:type="dxa"/>
+            </w:tcMar>
+          </w:tcPr>
+          <w:p>
+            <w:pPr>
+              <w:spacing w:after="40" w:line="264" w:lineRule="auto"/>
+            </w:pPr>
+            <w:r>
+              <w:rPr>
+                <w:rFonts w:ascii=".CJK Symbols Fallback SC" w:hAnsi=".CJK Symbols Fallback SC" w:eastAsia=".CJK Symbols Fallback SC" w:cs=".CJK Symbols Fallback SC" w:hint="eastAsia"/>
+                <w:b w:val="0"/>
+                <w:color w:val="16324F"/>
+                <w:sz w:val="19"/>
+              </w:rPr>
+            </w:r>
+            <w:r>
+              <w:rPr>
+                <w:rFonts w:ascii=".CJK Symbols Fallback SC" w:hAnsi=".CJK Symbols Fallback SC" w:eastAsia=".CJK Symbols Fallback SC" w:cs=".CJK Symbols Fallback SC" w:hint="eastAsia"/>
+                <w:b w:val="0"/>
+                <w:color w:val="16324F"/>
+                <w:sz w:val="19"/>
+              </w:rPr>
+              <w:t>先确认项目能打开</w:t>
+            </w:r>
+          </w:p>
+        </w:tc>
+        <w:tc>
+          <w:tcPr>
+            <w:tcW w:type="dxa" w:w="3300"/>
+            <w:vAlign w:val="center"/>
+            <w:tcMar>
+              <w:top w:w="80" w:type="dxa"/>
+              <w:start w:w="120" w:type="dxa"/>
+              <w:bottom w:w="80" w:type="dxa"/>
+              <w:end w:w="120" w:type="dxa"/>
+            </w:tcMar>
+          </w:tcPr>
+          <w:p>
+            <w:pPr>
+              <w:spacing w:after="40" w:line="264" w:lineRule="auto"/>
+            </w:pPr>
+            <w:r>
+              <w:rPr>
+                <w:rFonts w:ascii=".CJK Symbols Fallback SC" w:hAnsi=".CJK Symbols Fallback SC" w:eastAsia=".CJK Symbols Fallback SC" w:cs=".CJK Symbols Fallback SC" w:hint="eastAsia"/>
+                <w:b w:val="0"/>
+                <w:color w:val="16324F"/>
+                <w:sz w:val="19"/>
+              </w:rPr>
+            </w:r>
+            <w:r>
+              <w:rPr>
+                <w:rFonts w:ascii=".CJK Symbols Fallback SC" w:hAnsi=".CJK Symbols Fallback SC" w:eastAsia=".CJK Symbols Fallback SC" w:cs=".CJK Symbols Fallback SC" w:hint="eastAsia"/>
+                <w:b w:val="0"/>
+                <w:color w:val="16324F"/>
+                <w:sz w:val="19"/>
+              </w:rPr>
+              <w:t>Demo 模式，第 3 节</w:t>
+            </w:r>
+          </w:p>
+        </w:tc>
+        <w:tc>
+          <w:tcPr>
+            <w:tcW w:type="dxa" w:w="4460"/>
+            <w:vAlign w:val="center"/>
+            <w:tcMar>
+              <w:top w:w="80" w:type="dxa"/>
+              <w:start w:w="120" w:type="dxa"/>
+              <w:bottom w:w="80" w:type="dxa"/>
+              <w:end w:w="120" w:type="dxa"/>
+            </w:tcMar>
+          </w:tcPr>
+          <w:p>
+            <w:pPr>
+              <w:spacing w:after="40" w:line="264" w:lineRule="auto"/>
+            </w:pPr>
+            <w:r>
+              <w:rPr>
+                <w:rFonts w:ascii=".CJK Symbols Fallback SC" w:hAnsi=".CJK Symbols Fallback SC" w:eastAsia=".CJK Symbols Fallback SC" w:cs=".CJK Symbols Fallback SC" w:hint="eastAsia"/>
+                <w:b w:val="0"/>
+                <w:color w:val="16324F"/>
+                <w:sz w:val="19"/>
+              </w:rPr>
+            </w:r>
+            <w:r>
+              <w:rPr>
+                <w:rFonts w:ascii=".CJK Symbols Fallback SC" w:hAnsi=".CJK Symbols Fallback SC" w:eastAsia=".CJK Symbols Fallback SC" w:cs=".CJK Symbols Fallback SC" w:hint="eastAsia"/>
+                <w:b w:val="0"/>
+                <w:color w:val="16324F"/>
+                <w:sz w:val="19"/>
+              </w:rPr>
+              <w:t>否</w:t>
+            </w:r>
+          </w:p>
+        </w:tc>
+      </w:tr>
+      <w:tr>
+        <w:tc>
+          <w:tcPr>
+            <w:tcW w:type="dxa" w:w="1600"/>
+            <w:vAlign w:val="center"/>
+            <w:tcMar>
+              <w:top w:w="80" w:type="dxa"/>
+              <w:start w:w="120" w:type="dxa"/>
+              <w:bottom w:w="80" w:type="dxa"/>
+              <w:end w:w="120" w:type="dxa"/>
+            </w:tcMar>
+          </w:tcPr>
+          <w:p>
+            <w:pPr>
+              <w:spacing w:after="40" w:line="264" w:lineRule="auto"/>
+            </w:pPr>
+            <w:r>
+              <w:rPr>
+                <w:rFonts w:ascii=".CJK Symbols Fallback SC" w:hAnsi=".CJK Symbols Fallback SC" w:eastAsia=".CJK Symbols Fallback SC" w:cs=".CJK Symbols Fallback SC" w:hint="eastAsia"/>
+                <w:b w:val="0"/>
+                <w:color w:val="16324F"/>
+                <w:sz w:val="19"/>
+              </w:rPr>
+            </w:r>
+            <w:r>
+              <w:rPr>
+                <w:rFonts w:ascii=".CJK Symbols Fallback SC" w:hAnsi=".CJK Symbols Fallback SC" w:eastAsia=".CJK Symbols Fallback SC" w:cs=".CJK Symbols Fallback SC" w:hint="eastAsia"/>
+                <w:b w:val="0"/>
+                <w:color w:val="16324F"/>
+                <w:sz w:val="19"/>
+              </w:rPr>
+              <w:t>同学不安装 Ollama</w:t>
+            </w:r>
+          </w:p>
+        </w:tc>
+        <w:tc>
+          <w:tcPr>
+            <w:tcW w:type="dxa" w:w="3300"/>
+            <w:vAlign w:val="center"/>
+            <w:tcMar>
+              <w:top w:w="80" w:type="dxa"/>
+              <w:start w:w="120" w:type="dxa"/>
+              <w:bottom w:w="80" w:type="dxa"/>
+              <w:end w:w="120" w:type="dxa"/>
+            </w:tcMar>
+          </w:tcPr>
+          <w:p>
+            <w:pPr>
+              <w:spacing w:after="40" w:line="264" w:lineRule="auto"/>
+            </w:pPr>
+            <w:r>
+              <w:rPr>
+                <w:rFonts w:ascii=".CJK Symbols Fallback SC" w:hAnsi=".CJK Symbols Fallback SC" w:eastAsia=".CJK Symbols Fallback SC" w:cs=".CJK Symbols Fallback SC" w:hint="eastAsia"/>
+                <w:b w:val="0"/>
+                <w:color w:val="16324F"/>
+                <w:sz w:val="19"/>
+              </w:rPr>
+            </w:r>
+            <w:r>
+              <w:rPr>
+                <w:rFonts w:ascii=".CJK Symbols Fallback SC" w:hAnsi=".CJK Symbols Fallback SC" w:eastAsia=".CJK Symbols Fallback SC" w:cs=".CJK Symbols Fallback SC" w:hint="eastAsia"/>
+                <w:b w:val="0"/>
+                <w:color w:val="16324F"/>
+                <w:sz w:val="19"/>
+              </w:rPr>
+              <w:t>远程模型，第 5 节</w:t>
+            </w:r>
+          </w:p>
+        </w:tc>
+        <w:tc>
+          <w:tcPr>
+            <w:tcW w:type="dxa" w:w="4460"/>
+            <w:vAlign w:val="center"/>
+            <w:tcMar>
+              <w:top w:w="80" w:type="dxa"/>
+              <w:start w:w="120" w:type="dxa"/>
+              <w:bottom w:w="80" w:type="dxa"/>
+              <w:end w:w="120" w:type="dxa"/>
+            </w:tcMar>
+          </w:tcPr>
+          <w:p>
+            <w:pPr>
+              <w:spacing w:after="40" w:line="264" w:lineRule="auto"/>
+            </w:pPr>
+            <w:r>
+              <w:rPr>
+                <w:rFonts w:ascii=".CJK Symbols Fallback SC" w:hAnsi=".CJK Symbols Fallback SC" w:eastAsia=".CJK Symbols Fallback SC" w:cs=".CJK Symbols Fallback SC" w:hint="eastAsia"/>
+                <w:b w:val="0"/>
+                <w:color w:val="16324F"/>
+                <w:sz w:val="19"/>
+              </w:rPr>
+            </w:r>
+            <w:r>
+              <w:rPr>
+                <w:rFonts w:ascii=".CJK Symbols Fallback SC" w:hAnsi=".CJK Symbols Fallback SC" w:eastAsia=".CJK Symbols Fallback SC" w:cs=".CJK Symbols Fallback SC" w:hint="eastAsia"/>
+                <w:b w:val="0"/>
+                <w:color w:val="16324F"/>
+                <w:sz w:val="19"/>
+              </w:rPr>
+              <w:t>否，但需要自己的 API Key</w:t>
+            </w:r>
+          </w:p>
+        </w:tc>
+      </w:tr>
+      <w:tr>
+        <w:tc>
+          <w:tcPr>
+            <w:tcW w:type="dxa" w:w="1600"/>
+            <w:vAlign w:val="center"/>
+            <w:tcMar>
+              <w:top w:w="80" w:type="dxa"/>
+              <w:start w:w="120" w:type="dxa"/>
+              <w:bottom w:w="80" w:type="dxa"/>
+              <w:end w:w="120" w:type="dxa"/>
+            </w:tcMar>
+          </w:tcPr>
+          <w:p>
+            <w:pPr>
+              <w:spacing w:after="40" w:line="264" w:lineRule="auto"/>
+            </w:pPr>
+            <w:r>
+              <w:rPr>
+                <w:rFonts w:ascii=".CJK Symbols Fallback SC" w:hAnsi=".CJK Symbols Fallback SC" w:eastAsia=".CJK Symbols Fallback SC" w:cs=".CJK Symbols Fallback SC" w:hint="eastAsia"/>
+                <w:b w:val="0"/>
+                <w:color w:val="16324F"/>
+                <w:sz w:val="19"/>
+              </w:rPr>
+            </w:r>
+            <w:r>
+              <w:rPr>
+                <w:rFonts w:ascii=".CJK Symbols Fallback SC" w:hAnsi=".CJK Symbols Fallback SC" w:eastAsia=".CJK Symbols Fallback SC" w:cs=".CJK Symbols Fallback SC" w:hint="eastAsia"/>
+                <w:b w:val="0"/>
+                <w:color w:val="16324F"/>
+                <w:sz w:val="19"/>
+              </w:rPr>
+              <w:t>完全使用本地开源模型</w:t>
+            </w:r>
+          </w:p>
+        </w:tc>
+        <w:tc>
+          <w:tcPr>
+            <w:tcW w:type="dxa" w:w="3300"/>
+            <w:vAlign w:val="center"/>
+            <w:tcMar>
+              <w:top w:w="80" w:type="dxa"/>
+              <w:start w:w="120" w:type="dxa"/>
+              <w:bottom w:w="80" w:type="dxa"/>
+              <w:end w:w="120" w:type="dxa"/>
+            </w:tcMar>
+          </w:tcPr>
+          <w:p>
+            <w:pPr>
+              <w:spacing w:after="40" w:line="264" w:lineRule="auto"/>
+            </w:pPr>
+            <w:r>
+              <w:rPr>
+                <w:rFonts w:ascii=".CJK Symbols Fallback SC" w:hAnsi=".CJK Symbols Fallback SC" w:eastAsia=".CJK Symbols Fallback SC" w:cs=".CJK Symbols Fallback SC" w:hint="eastAsia"/>
+                <w:b w:val="0"/>
+                <w:color w:val="16324F"/>
+                <w:sz w:val="19"/>
+              </w:rPr>
+            </w:r>
+            <w:r>
+              <w:rPr>
+                <w:rFonts w:ascii=".CJK Symbols Fallback SC" w:hAnsi=".CJK Symbols Fallback SC" w:eastAsia=".CJK Symbols Fallback SC" w:cs=".CJK Symbols Fallback SC" w:hint="eastAsia"/>
+                <w:b w:val="0"/>
+                <w:color w:val="16324F"/>
+                <w:sz w:val="19"/>
+              </w:rPr>
+              <w:t>Ollama 模式，第 4 节</w:t>
+            </w:r>
+          </w:p>
+        </w:tc>
+        <w:tc>
+          <w:tcPr>
+            <w:tcW w:type="dxa" w:w="4460"/>
+            <w:vAlign w:val="center"/>
+            <w:tcMar>
+              <w:top w:w="80" w:type="dxa"/>
+              <w:start w:w="120" w:type="dxa"/>
+              <w:bottom w:w="80" w:type="dxa"/>
+              <w:end w:w="120" w:type="dxa"/>
+            </w:tcMar>
+          </w:tcPr>
+          <w:p>
+            <w:pPr>
+              <w:spacing w:after="40" w:line="264" w:lineRule="auto"/>
+            </w:pPr>
+            <w:r>
+              <w:rPr>
+                <w:rFonts w:ascii=".CJK Symbols Fallback SC" w:hAnsi=".CJK Symbols Fallback SC" w:eastAsia=".CJK Symbols Fallback SC" w:cs=".CJK Symbols Fallback SC" w:hint="eastAsia"/>
+                <w:b w:val="0"/>
+                <w:color w:val="16324F"/>
+                <w:sz w:val="19"/>
+              </w:rPr>
+            </w:r>
+            <w:r>
+              <w:rPr>
+                <w:rFonts w:ascii=".CJK Symbols Fallback SC" w:hAnsi=".CJK Symbols Fallback SC" w:eastAsia=".CJK Symbols Fallback SC" w:cs=".CJK Symbols Fallback SC" w:hint="eastAsia"/>
+                <w:b w:val="0"/>
+                <w:color w:val="16324F"/>
+                <w:sz w:val="19"/>
+              </w:rPr>
+              <w:t>是，约 2GB 起</w:t>
+            </w:r>
+          </w:p>
+        </w:tc>
+      </w:tr>
+    </w:tbl>
+    <w:p>
+      <w:pPr>
+        <w:spacing w:after="20"/>
+      </w:pPr>
+    </w:p>
+    <w:p>
+      <w:r>
+        <w:rPr>
+          <w:rFonts w:ascii=".CJK Symbols Fallback SC" w:hAnsi=".CJK Symbols Fallback SC" w:eastAsia=".CJK Symbols Fallback SC" w:cs=".CJK Symbols Fallback SC" w:hint="eastAsia"/>
+          <w:color w:val="16324F"/>
+          <w:sz w:val="22"/>
+        </w:rPr>
+        <w:t>第一次使用建议先运行 Demo。Demo 能先验证页面、Agent trace、MCP、Skill 和安全边界，成功后再配置模型。</w:t>
+      </w:r>
+    </w:p>
+    <w:p>
+      <w:pPr>
+        <w:pStyle w:val="Heading2"/>
+      </w:pPr>
+      <w:r>
+        <w:t>2.5 不要提交或分享这些内容</w:t>
+      </w:r>
+    </w:p>
+    <w:p>
+      <w:r>
+        <w:rPr>
+          <w:rFonts w:ascii=".CJK Symbols Fallback SC" w:hAnsi=".CJK Symbols Fallback SC" w:eastAsia=".CJK Symbols Fallback SC" w:cs=".CJK Symbols Fallback SC" w:hint="eastAsia"/>
+          <w:color w:val="16324F"/>
+          <w:sz w:val="22"/>
+        </w:rPr>
+        <w:t>不要把以下内容上传到 GitHub 或发给他人：</w:t>
+      </w:r>
+    </w:p>
+    <w:p>
+      <w:pPr>
+        <w:pStyle w:val="ListBullet"/>
+      </w:pPr>
       <w:r>
         <w:rPr>
           <w:rFonts w:ascii="Consolas" w:hAnsi="Consolas" w:eastAsia=".CJK Symbols Fallback SC" w:cs=".CJK Symbols Fallback SC" w:hint="eastAsia"/>
           <w:color w:val="344054"/>
           <w:sz w:val="19"/>
         </w:rPr>
-        <w:t>.env.example</w:t>
-      </w:r>
-      <w:r>
-        <w:rPr>
-          <w:rFonts w:ascii=".CJK Symbols Fallback SC" w:hAnsi=".CJK Symbols Fallback SC" w:eastAsia=".CJK Symbols Fallback SC" w:cs=".CJK Symbols Fallback SC" w:hint="eastAsia"/>
-          <w:color w:val="16324F"/>
-          <w:sz w:val="22"/>
-        </w:rPr>
-        <w:t xml:space="preserve"> 和 </w:t>
-      </w:r>
+        <w:t>.env</w:t>
+      </w:r>
+    </w:p>
+    <w:p>
+      <w:pPr>
+        <w:pStyle w:val="ListBullet"/>
+      </w:pPr>
       <w:r>
         <w:rPr>
           <w:rFonts w:ascii="Consolas" w:hAnsi="Consolas" w:eastAsia=".CJK Symbols Fallback SC" w:cs=".CJK Symbols Fallback SC" w:hint="eastAsia"/>
           <w:color w:val="344054"/>
           <w:sz w:val="19"/>
         </w:rPr>
+        <w:t>.env.remote</w:t>
+      </w:r>
+    </w:p>
+    <w:p>
+      <w:pPr>
+        <w:pStyle w:val="ListBullet"/>
+      </w:pPr>
+      <w:r>
+        <w:rPr>
+          <w:rFonts w:ascii=".CJK Symbols Fallback SC" w:hAnsi=".CJK Symbols Fallback SC" w:eastAsia=".CJK Symbols Fallback SC" w:cs=".CJK Symbols Fallback SC" w:hint="eastAsia"/>
+          <w:color w:val="16324F"/>
+          <w:sz w:val="22"/>
+        </w:rPr>
+        <w:t>真实 API Key</w:t>
+      </w:r>
+    </w:p>
+    <w:p>
+      <w:pPr>
+        <w:pStyle w:val="ListBullet"/>
+      </w:pPr>
+      <w:r>
+        <w:rPr>
+          <w:rFonts w:ascii="Consolas" w:hAnsi="Consolas" w:eastAsia=".CJK Symbols Fallback SC" w:cs=".CJK Symbols Fallback SC" w:hint="eastAsia"/>
+          <w:color w:val="344054"/>
+          <w:sz w:val="19"/>
+        </w:rPr>
+        <w:t>.venv/</w:t>
+      </w:r>
+    </w:p>
+    <w:p>
+      <w:pPr>
+        <w:pStyle w:val="ListBullet"/>
+      </w:pPr>
+      <w:r>
+        <w:rPr>
+          <w:rFonts w:ascii=".CJK Symbols Fallback SC" w:hAnsi=".CJK Symbols Fallback SC" w:eastAsia=".CJK Symbols Fallback SC" w:cs=".CJK Symbols Fallback SC" w:hint="eastAsia"/>
+          <w:color w:val="16324F"/>
+          <w:sz w:val="22"/>
+        </w:rPr>
+        <w:t>Ollama 模型文件</w:t>
+      </w:r>
+    </w:p>
+    <w:p>
+      <w:pPr>
+        <w:pStyle w:val="ListBullet"/>
+      </w:pPr>
+      <w:r>
+        <w:rPr>
+          <w:rFonts w:ascii="Consolas" w:hAnsi="Consolas" w:eastAsia=".CJK Symbols Fallback SC" w:cs=".CJK Symbols Fallback SC" w:hint="eastAsia"/>
+          <w:color w:val="344054"/>
+          <w:sz w:val="19"/>
+        </w:rPr>
+        <w:t>data/vector_db/</w:t>
+      </w:r>
+    </w:p>
+    <w:p>
+      <w:r>
+        <w:rPr>
+          <w:rFonts w:ascii=".CJK Symbols Fallback SC" w:hAnsi=".CJK Symbols Fallback SC" w:eastAsia=".CJK Symbols Fallback SC" w:cs=".CJK Symbols Fallback SC" w:hint="eastAsia"/>
+          <w:color w:val="16324F"/>
+          <w:sz w:val="22"/>
+        </w:rPr>
+        <w:t xml:space="preserve">项目中提供的是 </w:t>
+      </w:r>
+      <w:r>
+        <w:rPr>
+          <w:rFonts w:ascii="Consolas" w:hAnsi="Consolas" w:eastAsia=".CJK Symbols Fallback SC" w:cs=".CJK Symbols Fallback SC" w:hint="eastAsia"/>
+          <w:color w:val="344054"/>
+          <w:sz w:val="19"/>
+        </w:rPr>
+        <w:t>.env.example</w:t>
+      </w:r>
+      <w:r>
+        <w:rPr>
+          <w:rFonts w:ascii=".CJK Symbols Fallback SC" w:hAnsi=".CJK Symbols Fallback SC" w:eastAsia=".CJK Symbols Fallback SC" w:cs=".CJK Symbols Fallback SC" w:hint="eastAsia"/>
+          <w:color w:val="16324F"/>
+          <w:sz w:val="22"/>
+        </w:rPr>
+        <w:t xml:space="preserve"> 和 </w:t>
+      </w:r>
+      <w:r>
+        <w:rPr>
+          <w:rFonts w:ascii="Consolas" w:hAnsi="Consolas" w:eastAsia=".CJK Symbols Fallback SC" w:cs=".CJK Symbols Fallback SC" w:hint="eastAsia"/>
+          <w:color w:val="344054"/>
+          <w:sz w:val="19"/>
+        </w:rPr>
         <w:t>.env.remote.example</w:t>
       </w:r>
       <w:r>
@@ -2092,6 +2906,300 @@
           <w:sz w:val="22"/>
         </w:rPr>
         <w:t>，它们只是配置模板。</w:t>
+      </w:r>
+    </w:p>
+    <w:p>
+      <w:pPr>
+        <w:pStyle w:val="Heading2"/>
+      </w:pPr>
+      <w:r>
+        <w:t>2.6 Clone 后三分钟验证路径</w:t>
+      </w:r>
+    </w:p>
+    <w:p>
+      <w:r>
+        <w:rPr>
+          <w:rFonts w:ascii=".CJK Symbols Fallback SC" w:hAnsi=".CJK Symbols Fallback SC" w:eastAsia=".CJK Symbols Fallback SC" w:cs=".CJK Symbols Fallback SC" w:hint="eastAsia"/>
+          <w:color w:val="16324F"/>
+          <w:sz w:val="22"/>
+        </w:rPr>
+        <w:t>如果只是想确认同学电脑能否运行，直接执行下面的最短路径。</w:t>
+      </w:r>
+    </w:p>
+    <w:p>
+      <w:r>
+        <w:rPr>
+          <w:rFonts w:ascii=".CJK Symbols Fallback SC" w:hAnsi=".CJK Symbols Fallback SC" w:eastAsia=".CJK Symbols Fallback SC" w:cs=".CJK Symbols Fallback SC" w:hint="eastAsia"/>
+          <w:color w:val="16324F"/>
+          <w:sz w:val="22"/>
+        </w:rPr>
+        <w:t>macOS/Linux：</w:t>
+      </w:r>
+    </w:p>
+    <w:p>
+      <w:pPr>
+        <w:spacing w:before="100" w:after="40"/>
+      </w:pPr>
+      <w:r>
+        <w:rPr>
+          <w:rFonts w:ascii=".CJK Symbols Fallback SC" w:hAnsi=".CJK Symbols Fallback SC" w:eastAsia=".CJK Symbols Fallback SC" w:cs=".CJK Symbols Fallback SC" w:hint="eastAsia"/>
+          <w:b/>
+          <w:color w:val="A87127"/>
+          <w:sz w:val="16"/>
+        </w:rPr>
+        <w:t>BASH</w:t>
+      </w:r>
+    </w:p>
+    <w:p>
+      <w:pPr>
+        <w:pStyle w:val="ManualCode"/>
+        <w:shd w:fill="F4F6F8"/>
+      </w:pPr>
+      <w:r>
+        <w:rPr>
+          <w:rFonts w:ascii=".CJK Symbols Fallback SC" w:hAnsi=".CJK Symbols Fallback SC" w:eastAsia=".CJK Symbols Fallback SC" w:cs=".CJK Symbols Fallback SC" w:hint="eastAsia"/>
+          <w:color w:val="16324F"/>
+          <w:sz w:val="22"/>
+        </w:rPr>
+        <w:t>git clone https://github.com/Wing-Chen0731/financial-multi-agent-due-diligence.git</w:t>
+      </w:r>
+    </w:p>
+    <w:p>
+      <w:pPr>
+        <w:pStyle w:val="ManualCode"/>
+        <w:shd w:fill="F4F6F8"/>
+      </w:pPr>
+      <w:r>
+        <w:rPr>
+          <w:rFonts w:ascii=".CJK Symbols Fallback SC" w:hAnsi=".CJK Symbols Fallback SC" w:eastAsia=".CJK Symbols Fallback SC" w:cs=".CJK Symbols Fallback SC" w:hint="eastAsia"/>
+          <w:color w:val="16324F"/>
+          <w:sz w:val="22"/>
+        </w:rPr>
+        <w:t>cd financial-multi-agent-due-diligence</w:t>
+      </w:r>
+    </w:p>
+    <w:p>
+      <w:pPr>
+        <w:pStyle w:val="ManualCode"/>
+        <w:shd w:fill="F4F6F8"/>
+      </w:pPr>
+      <w:r>
+        <w:rPr>
+          <w:rFonts w:ascii=".CJK Symbols Fallback SC" w:hAnsi=".CJK Symbols Fallback SC" w:eastAsia=".CJK Symbols Fallback SC" w:cs=".CJK Symbols Fallback SC" w:hint="eastAsia"/>
+          <w:color w:val="16324F"/>
+          <w:sz w:val="22"/>
+        </w:rPr>
+        <w:t>bash scripts/start.sh --demo</w:t>
+      </w:r>
+    </w:p>
+    <w:p>
+      <w:r>
+        <w:rPr>
+          <w:rFonts w:ascii=".CJK Symbols Fallback SC" w:hAnsi=".CJK Symbols Fallback SC" w:eastAsia=".CJK Symbols Fallback SC" w:cs=".CJK Symbols Fallback SC" w:hint="eastAsia"/>
+          <w:color w:val="16324F"/>
+          <w:sz w:val="22"/>
+        </w:rPr>
+        <w:t>Windows PowerShell：</w:t>
+      </w:r>
+    </w:p>
+    <w:p>
+      <w:pPr>
+        <w:spacing w:before="100" w:after="40"/>
+      </w:pPr>
+      <w:r>
+        <w:rPr>
+          <w:rFonts w:ascii=".CJK Symbols Fallback SC" w:hAnsi=".CJK Symbols Fallback SC" w:eastAsia=".CJK Symbols Fallback SC" w:cs=".CJK Symbols Fallback SC" w:hint="eastAsia"/>
+          <w:b/>
+          <w:color w:val="A87127"/>
+          <w:sz w:val="16"/>
+        </w:rPr>
+        <w:t>POWERSHELL</w:t>
+      </w:r>
+    </w:p>
+    <w:p>
+      <w:pPr>
+        <w:pStyle w:val="ManualCode"/>
+        <w:shd w:fill="F4F6F8"/>
+      </w:pPr>
+      <w:r>
+        <w:rPr>
+          <w:rFonts w:ascii=".CJK Symbols Fallback SC" w:hAnsi=".CJK Symbols Fallback SC" w:eastAsia=".CJK Symbols Fallback SC" w:cs=".CJK Symbols Fallback SC" w:hint="eastAsia"/>
+          <w:color w:val="16324F"/>
+          <w:sz w:val="22"/>
+        </w:rPr>
+        <w:t>git clone https://github.com/Wing-Chen0731/financial-multi-agent-due-diligence.git</w:t>
+      </w:r>
+    </w:p>
+    <w:p>
+      <w:pPr>
+        <w:pStyle w:val="ManualCode"/>
+        <w:shd w:fill="F4F6F8"/>
+      </w:pPr>
+      <w:r>
+        <w:rPr>
+          <w:rFonts w:ascii=".CJK Symbols Fallback SC" w:hAnsi=".CJK Symbols Fallback SC" w:eastAsia=".CJK Symbols Fallback SC" w:cs=".CJK Symbols Fallback SC" w:hint="eastAsia"/>
+          <w:color w:val="16324F"/>
+          <w:sz w:val="22"/>
+        </w:rPr>
+        <w:t>cd financial-multi-agent-due-diligence</w:t>
+      </w:r>
+    </w:p>
+    <w:p>
+      <w:pPr>
+        <w:pStyle w:val="ManualCode"/>
+        <w:shd w:fill="F4F6F8"/>
+      </w:pPr>
+      <w:r>
+        <w:rPr>
+          <w:rFonts w:ascii=".CJK Symbols Fallback SC" w:hAnsi=".CJK Symbols Fallback SC" w:eastAsia=".CJK Symbols Fallback SC" w:cs=".CJK Symbols Fallback SC" w:hint="eastAsia"/>
+          <w:color w:val="16324F"/>
+          <w:sz w:val="22"/>
+        </w:rPr>
+        <w:t>python -m venv .venv</w:t>
+      </w:r>
+    </w:p>
+    <w:p>
+      <w:pPr>
+        <w:pStyle w:val="ManualCode"/>
+        <w:shd w:fill="F4F6F8"/>
+      </w:pPr>
+      <w:r>
+        <w:rPr>
+          <w:rFonts w:ascii=".CJK Symbols Fallback SC" w:hAnsi=".CJK Symbols Fallback SC" w:eastAsia=".CJK Symbols Fallback SC" w:cs=".CJK Symbols Fallback SC" w:hint="eastAsia"/>
+          <w:color w:val="16324F"/>
+          <w:sz w:val="22"/>
+        </w:rPr>
+        <w:t>.venv\Scripts\python.exe -m pip install -e ".[dev]"</w:t>
+      </w:r>
+    </w:p>
+    <w:p>
+      <w:pPr>
+        <w:pStyle w:val="ManualCode"/>
+        <w:shd w:fill="F4F6F8"/>
+      </w:pPr>
+      <w:r>
+        <w:rPr>
+          <w:rFonts w:ascii=".CJK Symbols Fallback SC" w:hAnsi=".CJK Symbols Fallback SC" w:eastAsia=".CJK Symbols Fallback SC" w:cs=".CJK Symbols Fallback SC" w:hint="eastAsia"/>
+          <w:color w:val="16324F"/>
+          <w:sz w:val="22"/>
+        </w:rPr>
+        <w:t>$env:LLM_PROVIDER="demo"</w:t>
+      </w:r>
+    </w:p>
+    <w:p>
+      <w:pPr>
+        <w:pStyle w:val="ManualCode"/>
+        <w:shd w:fill="F4F6F8"/>
+      </w:pPr>
+      <w:r>
+        <w:rPr>
+          <w:rFonts w:ascii=".CJK Symbols Fallback SC" w:hAnsi=".CJK Symbols Fallback SC" w:eastAsia=".CJK Symbols Fallback SC" w:cs=".CJK Symbols Fallback SC" w:hint="eastAsia"/>
+          <w:color w:val="16324F"/>
+          <w:sz w:val="22"/>
+        </w:rPr>
+        <w:t>$env:AGENT_EXECUTION_MODE="fast"</w:t>
+      </w:r>
+    </w:p>
+    <w:p>
+      <w:pPr>
+        <w:pStyle w:val="ManualCode"/>
+        <w:shd w:fill="F4F6F8"/>
+      </w:pPr>
+      <w:r>
+        <w:rPr>
+          <w:rFonts w:ascii=".CJK Symbols Fallback SC" w:hAnsi=".CJK Symbols Fallback SC" w:eastAsia=".CJK Symbols Fallback SC" w:cs=".CJK Symbols Fallback SC" w:hint="eastAsia"/>
+          <w:color w:val="16324F"/>
+          <w:sz w:val="22"/>
+        </w:rPr>
+        <w:t>$env:RAG_MODE="lexical"</w:t>
+      </w:r>
+    </w:p>
+    <w:p>
+      <w:pPr>
+        <w:pStyle w:val="ManualCode"/>
+        <w:shd w:fill="F4F6F8"/>
+      </w:pPr>
+      <w:r>
+        <w:rPr>
+          <w:rFonts w:ascii=".CJK Symbols Fallback SC" w:hAnsi=".CJK Symbols Fallback SC" w:eastAsia=".CJK Symbols Fallback SC" w:cs=".CJK Symbols Fallback SC" w:hint="eastAsia"/>
+          <w:color w:val="16324F"/>
+          <w:sz w:val="22"/>
+        </w:rPr>
+        <w:t>.venv\Scripts\python.exe -m uvicorn src.api.server:app --host 127.0.0.1 --port 8000</w:t>
+      </w:r>
+    </w:p>
+    <w:p>
+      <w:r>
+        <w:rPr>
+          <w:rFonts w:ascii=".CJK Symbols Fallback SC" w:hAnsi=".CJK Symbols Fallback SC" w:eastAsia=".CJK Symbols Fallback SC" w:cs=".CJK Symbols Fallback SC" w:hint="eastAsia"/>
+          <w:color w:val="16324F"/>
+          <w:sz w:val="22"/>
+        </w:rPr>
+        <w:t>如果 Windows 使用远程模型，请先运行：</w:t>
+      </w:r>
+    </w:p>
+    <w:p>
+      <w:pPr>
+        <w:spacing w:before="100" w:after="40"/>
+      </w:pPr>
+      <w:r>
+        <w:rPr>
+          <w:rFonts w:ascii=".CJK Symbols Fallback SC" w:hAnsi=".CJK Symbols Fallback SC" w:eastAsia=".CJK Symbols Fallback SC" w:cs=".CJK Symbols Fallback SC" w:hint="eastAsia"/>
+          <w:b/>
+          <w:color w:val="A87127"/>
+          <w:sz w:val="16"/>
+        </w:rPr>
+        <w:t>POWERSHELL</w:t>
+      </w:r>
+    </w:p>
+    <w:p>
+      <w:pPr>
+        <w:pStyle w:val="ManualCode"/>
+        <w:shd w:fill="F4F6F8"/>
+      </w:pPr>
+      <w:r>
+        <w:rPr>
+          <w:rFonts w:ascii=".CJK Symbols Fallback SC" w:hAnsi=".CJK Symbols Fallback SC" w:eastAsia=".CJK Symbols Fallback SC" w:cs=".CJK Symbols Fallback SC" w:hint="eastAsia"/>
+          <w:color w:val="16324F"/>
+          <w:sz w:val="22"/>
+        </w:rPr>
+        <w:t>.\scripts\start_remote.ps1</w:t>
+      </w:r>
+    </w:p>
+    <w:p>
+      <w:r>
+        <w:rPr>
+          <w:rFonts w:ascii=".CJK Symbols Fallback SC" w:hAnsi=".CJK Symbols Fallback SC" w:eastAsia=".CJK Symbols Fallback SC" w:cs=".CJK Symbols Fallback SC" w:hint="eastAsia"/>
+          <w:color w:val="16324F"/>
+          <w:sz w:val="22"/>
+        </w:rPr>
+        <w:t xml:space="preserve">第一次运行会生成 </w:t>
+      </w:r>
+      <w:r>
+        <w:rPr>
+          <w:rFonts w:ascii="Consolas" w:hAnsi="Consolas" w:eastAsia=".CJK Symbols Fallback SC" w:cs=".CJK Symbols Fallback SC" w:hint="eastAsia"/>
+          <w:color w:val="344054"/>
+          <w:sz w:val="19"/>
+        </w:rPr>
+        <w:t>.env.remote</w:t>
+      </w:r>
+      <w:r>
+        <w:rPr>
+          <w:rFonts w:ascii=".CJK Symbols Fallback SC" w:hAnsi=".CJK Symbols Fallback SC" w:eastAsia=".CJK Symbols Fallback SC" w:cs=".CJK Symbols Fallback SC" w:hint="eastAsia"/>
+          <w:color w:val="16324F"/>
+          <w:sz w:val="22"/>
+        </w:rPr>
+        <w:t xml:space="preserve"> 并提示填写 API Key；填写后再次执行同一命令。</w:t>
+      </w:r>
+    </w:p>
+    <w:p>
+      <w:r>
+        <w:rPr>
+          <w:rFonts w:ascii=".CJK Symbols Fallback SC" w:hAnsi=".CJK Symbols Fallback SC" w:eastAsia=".CJK Symbols Fallback SC" w:cs=".CJK Symbols Fallback SC" w:hint="eastAsia"/>
+          <w:color w:val="16324F"/>
+          <w:sz w:val="22"/>
+        </w:rPr>
+        <w:t>启动成功后打开 http://127.0.0.1:8000/。看到首页后，再按照第 6 节输入第一条测试问题。</w:t>
       </w:r>
     </w:p>
     <w:p>
@@ -2153,7 +3261,7 @@
           <w:color w:val="16324F"/>
           <w:sz w:val="22"/>
         </w:rPr>
-        <w:t>./scripts/start.sh --demo</w:t>
+        <w:t>bash scripts/start.sh --demo</w:t>
       </w:r>
     </w:p>
     <w:p>
@@ -2519,7 +3627,7 @@
           <w:color w:val="16324F"/>
           <w:sz w:val="22"/>
         </w:rPr>
-        <w:t>./scripts/setup.sh</w:t>
+        <w:t>bash scripts/setup.sh</w:t>
       </w:r>
     </w:p>
     <w:p>
@@ -2728,7 +3836,7 @@
           <w:color w:val="16324F"/>
           <w:sz w:val="22"/>
         </w:rPr>
-        <w:t>./scripts/start.sh</w:t>
+        <w:t>bash scripts/start.sh</w:t>
       </w:r>
     </w:p>
     <w:p>
@@ -3144,7 +4252,7 @@
           <w:color w:val="16324F"/>
           <w:sz w:val="22"/>
         </w:rPr>
-        <w:t>./scripts/start.sh</w:t>
+        <w:t>bash scripts/start.sh</w:t>
       </w:r>
     </w:p>
     <w:p>
@@ -3404,7 +4512,7 @@
           <w:color w:val="16324F"/>
           <w:sz w:val="22"/>
         </w:rPr>
-        <w:t>./scripts/start_remote.sh</w:t>
+        <w:t>bash scripts/start_remote.sh</w:t>
       </w:r>
     </w:p>
     <w:p>
@@ -3534,7 +4642,7 @@
           <w:color w:val="16324F"/>
           <w:sz w:val="22"/>
         </w:rPr>
-        <w:t>./scripts/start_remote.sh</w:t>
+        <w:t>bash scripts/start_remote.sh</w:t>
       </w:r>
     </w:p>
     <w:p>
@@ -3752,7 +4860,7 @@
           <w:color w:val="16324F"/>
           <w:sz w:val="22"/>
         </w:rPr>
-        <w:t>./scripts/start_remote.sh</w:t>
+        <w:t>bash scripts/start_remote.sh</w:t>
       </w:r>
     </w:p>
     <w:p>
@@ -3979,7 +5087,7 @@
           <w:color w:val="16324F"/>
           <w:sz w:val="22"/>
         </w:rPr>
-        <w:t>./scripts/index_remote.sh</w:t>
+        <w:t>bash scripts/index_remote.sh</w:t>
       </w:r>
     </w:p>
     <w:p>
@@ -7656,7 +8764,7 @@
           <w:color w:val="16324F"/>
           <w:sz w:val="22"/>
         </w:rPr>
-        <w:t>PORT=8001 ./scripts/start.sh --demo</w:t>
+        <w:t>PORT=8001 bash scripts/start.sh --demo</w:t>
       </w:r>
     </w:p>
     <w:p>
@@ -7800,7 +8908,7 @@
           <w:color w:val="344054"/>
           <w:sz w:val="19"/>
         </w:rPr>
-        <w:t>./scripts/start.sh</w:t>
+        <w:t>bash scripts/start.sh</w:t>
       </w:r>
     </w:p>
     <w:p>
@@ -8697,7 +9805,7 @@
           <w:color w:val="16324F"/>
           <w:sz w:val="22"/>
         </w:rPr>
-        <w:t>./scripts/start.sh --demo</w:t>
+        <w:t>bash scripts/start.sh --demo</w:t>
       </w:r>
     </w:p>
     <w:p>
@@ -8733,7 +9841,7 @@
           <w:color w:val="16324F"/>
           <w:sz w:val="22"/>
         </w:rPr>
-        <w:t>./scripts/setup.sh</w:t>
+        <w:t>bash scripts/setup.sh</w:t>
       </w:r>
     </w:p>
     <w:p>
@@ -8747,7 +9855,7 @@
           <w:color w:val="16324F"/>
           <w:sz w:val="22"/>
         </w:rPr>
-        <w:t>./scripts/start.sh</w:t>
+        <w:t>bash scripts/start.sh</w:t>
       </w:r>
     </w:p>
     <w:p>
@@ -8783,7 +9891,7 @@
           <w:color w:val="16324F"/>
           <w:sz w:val="22"/>
         </w:rPr>
-        <w:t>./scripts/start_remote.sh</w:t>
+        <w:t>bash scripts/start_remote.sh</w:t>
       </w:r>
     </w:p>
     <w:p>
@@ -9017,9 +10125,6 @@
       </w:r>
     </w:p>
     <w:p>
-      <w:pPr>
-        <w:pStyle w:val="ListNumber"/>
-      </w:pPr>
       <w:r>
         <w:rPr>
           <w:rFonts w:ascii=".CJK Symbols Fallback SC" w:hAnsi=".CJK Symbols Fallback SC" w:eastAsia=".CJK Symbols Fallback SC" w:cs=".CJK Symbols Fallback SC" w:hint="eastAsia"/>
@@ -9039,9 +10144,6 @@
       </w:r>
     </w:p>
     <w:p>
-      <w:pPr>
-        <w:pStyle w:val="ListNumber"/>
-      </w:pPr>
       <w:r>
         <w:rPr>
           <w:rFonts w:ascii=".CJK Symbols Fallback SC" w:hAnsi=".CJK Symbols Fallback SC" w:eastAsia=".CJK Symbols Fallback SC" w:cs=".CJK Symbols Fallback SC" w:hint="eastAsia"/>
@@ -9061,9 +10163,6 @@
       </w:r>
     </w:p>
     <w:p>
-      <w:pPr>
-        <w:pStyle w:val="ListNumber"/>
-      </w:pPr>
       <w:r>
         <w:rPr>
           <w:rFonts w:ascii=".CJK Symbols Fallback SC" w:hAnsi=".CJK Symbols Fallback SC" w:eastAsia=".CJK Symbols Fallback SC" w:cs=".CJK Symbols Fallback SC" w:hint="eastAsia"/>
@@ -9083,9 +10182,6 @@
       </w:r>
     </w:p>
     <w:p>
-      <w:pPr>
-        <w:pStyle w:val="ListNumber"/>
-      </w:pPr>
       <w:r>
         <w:rPr>
           <w:rFonts w:ascii=".CJK Symbols Fallback SC" w:hAnsi=".CJK Symbols Fallback SC" w:eastAsia=".CJK Symbols Fallback SC" w:cs=".CJK Symbols Fallback SC" w:hint="eastAsia"/>
@@ -9105,9 +10201,6 @@
       </w:r>
     </w:p>
     <w:p>
-      <w:pPr>
-        <w:pStyle w:val="ListNumber"/>
-      </w:pPr>
       <w:r>
         <w:rPr>
           <w:rFonts w:ascii=".CJK Symbols Fallback SC" w:hAnsi=".CJK Symbols Fallback SC" w:eastAsia=".CJK Symbols Fallback SC" w:cs=".CJK Symbols Fallback SC" w:hint="eastAsia"/>
@@ -9127,9 +10220,6 @@
       </w:r>
     </w:p>
     <w:p>
-      <w:pPr>
-        <w:pStyle w:val="ListNumber"/>
-      </w:pPr>
       <w:r>
         <w:rPr>
           <w:rFonts w:ascii=".CJK Symbols Fallback SC" w:hAnsi=".CJK Symbols Fallback SC" w:eastAsia=".CJK Symbols Fallback SC" w:cs=".CJK Symbols Fallback SC" w:hint="eastAsia"/>

</xml_diff>

<commit_message>
docs: refine clone-first operation manual
Fix duplicated section numbering and finalize the clone-first Markdown and Word manuals.
</commit_message>
<xml_diff>
--- a/金融多智能体系统_详细操作手册.docx
+++ b/金融多智能体系统_详细操作手册.docx
@@ -536,19 +536,6 @@
           <w:color w:val="475467"/>
           <w:sz w:val="21"/>
         </w:rPr>
-        <w:t>2.1 检查 Python</w:t>
-      </w:r>
-    </w:p>
-    <w:p>
-      <w:pPr>
-        <w:pStyle w:val="ListBullet"/>
-      </w:pPr>
-      <w:r>
-        <w:rPr>
-          <w:rFonts w:ascii=".CJK Symbols Fallback SC" w:hAnsi=".CJK Symbols Fallback SC" w:eastAsia=".CJK Symbols Fallback SC" w:cs=".CJK Symbols Fallback SC" w:hint="eastAsia"/>
-          <w:color w:val="475467"/>
-          <w:sz w:val="21"/>
-        </w:rPr>
         <w:t>2.3 确认当前目录</w:t>
       </w:r>
     </w:p>
@@ -2038,14 +2025,6 @@
       </w:pPr>
       <w:r>
         <w:t>2.2 检查 Python</w:t>
-      </w:r>
-    </w:p>
-    <w:p>
-      <w:pPr>
-        <w:pStyle w:val="Heading2"/>
-      </w:pPr>
-      <w:r>
-        <w:t>2.1 检查 Python</w:t>
       </w:r>
     </w:p>
     <w:p>

</xml_diff>